<commit_message>
44 - sprint4 docu changes
</commit_message>
<xml_diff>
--- a/documentation/Sprint4.docx
+++ b/documentation/Sprint4.docx
@@ -330,23 +330,233 @@
           <w:b/>
           <w:bCs/>
         </w:rPr>
-        <w:t>OCR Worker (</w:t>
-      </w:r>
+        <w:t>OCR Worker refactoring</w:t>
+      </w:r>
+    </w:p>
+    <w:p>
+      <w:pPr>
+        <w:pStyle w:val="ListParagraph"/>
+        <w:numPr>
+          <w:ilvl w:val="0"/>
+          <w:numId w:val="14"/>
+        </w:numPr>
+      </w:pPr>
+      <w:r>
+        <w:t>Split the worker into:</w:t>
+      </w:r>
+    </w:p>
+    <w:p>
+      <w:pPr>
+        <w:pStyle w:val="ListParagraph"/>
+        <w:numPr>
+          <w:ilvl w:val="1"/>
+          <w:numId w:val="14"/>
+        </w:numPr>
+      </w:pPr>
       <w:proofErr w:type="spellStart"/>
       <w:r>
+        <w:t>OcrWorkerService</w:t>
+      </w:r>
+      <w:proofErr w:type="spellEnd"/>
+      <w:r>
+        <w:t xml:space="preserve"> (RabbitMQ connectivity and hosting).</w:t>
+      </w:r>
+    </w:p>
+    <w:p>
+      <w:pPr>
+        <w:pStyle w:val="ListParagraph"/>
+        <w:numPr>
+          <w:ilvl w:val="1"/>
+          <w:numId w:val="14"/>
+        </w:numPr>
+      </w:pPr>
+      <w:proofErr w:type="spellStart"/>
+      <w:r>
+        <w:t>OcrJobHandler</w:t>
+      </w:r>
+      <w:proofErr w:type="spellEnd"/>
+      <w:r>
+        <w:t xml:space="preserve"> (OCR workflow).</w:t>
+      </w:r>
+    </w:p>
+    <w:p>
+      <w:pPr>
+        <w:pStyle w:val="ListParagraph"/>
+        <w:numPr>
+          <w:ilvl w:val="0"/>
+          <w:numId w:val="14"/>
+        </w:numPr>
+      </w:pPr>
+      <w:r>
+        <w:t>Introduced abstractions:</w:t>
+      </w:r>
+    </w:p>
+    <w:p>
+      <w:pPr>
+        <w:pStyle w:val="ListParagraph"/>
+        <w:numPr>
+          <w:ilvl w:val="1"/>
+          <w:numId w:val="14"/>
+        </w:numPr>
+      </w:pPr>
+      <w:proofErr w:type="spellStart"/>
+      <w:r>
+        <w:t>IFileStoreClien</w:t>
+      </w:r>
+      <w:r>
+        <w:t>t</w:t>
+      </w:r>
+      <w:proofErr w:type="spellEnd"/>
+      <w:r>
+        <w:t xml:space="preserve"> / </w:t>
+      </w:r>
+      <w:proofErr w:type="spellStart"/>
+      <w:r>
+        <w:t>MinioFileStoreClient</w:t>
+      </w:r>
+      <w:proofErr w:type="spellEnd"/>
+      <w:r>
+        <w:t xml:space="preserve"> for </w:t>
+      </w:r>
+      <w:proofErr w:type="spellStart"/>
+      <w:r>
+        <w:t>MinIO</w:t>
+      </w:r>
+      <w:proofErr w:type="spellEnd"/>
+      <w:r>
+        <w:t xml:space="preserve"> access.</w:t>
+      </w:r>
+    </w:p>
+    <w:p>
+      <w:pPr>
+        <w:pStyle w:val="ListParagraph"/>
+        <w:numPr>
+          <w:ilvl w:val="1"/>
+          <w:numId w:val="14"/>
+        </w:numPr>
+      </w:pPr>
+      <w:proofErr w:type="spellStart"/>
+      <w:r>
+        <w:t>IOcrEngine</w:t>
+      </w:r>
+      <w:proofErr w:type="spellEnd"/>
+      <w:r>
+        <w:t xml:space="preserve"> / </w:t>
+      </w:r>
+      <w:proofErr w:type="spellStart"/>
+      <w:r>
+        <w:t>TesseractOcrEngine</w:t>
+      </w:r>
+      <w:proofErr w:type="spellEnd"/>
+      <w:r>
+        <w:t xml:space="preserve"> for OCR execution.</w:t>
+      </w:r>
+    </w:p>
+    <w:p>
+      <w:pPr>
+        <w:pStyle w:val="ListParagraph"/>
+        <w:numPr>
+          <w:ilvl w:val="0"/>
+          <w:numId w:val="14"/>
+        </w:numPr>
+      </w:pPr>
+      <w:r>
+        <w:t>Worker now:</w:t>
+      </w:r>
+    </w:p>
+    <w:p>
+      <w:pPr>
+        <w:pStyle w:val="ListParagraph"/>
+        <w:numPr>
+          <w:ilvl w:val="1"/>
+          <w:numId w:val="14"/>
+        </w:numPr>
+      </w:pPr>
+      <w:r>
+        <w:t xml:space="preserve">Consumes OCR jobs from </w:t>
+      </w:r>
+      <w:proofErr w:type="spellStart"/>
+      <w:r>
+        <w:t>paperless.ocr.input</w:t>
+      </w:r>
+      <w:proofErr w:type="spellEnd"/>
+      <w:r>
+        <w:t>.</w:t>
+      </w:r>
+    </w:p>
+    <w:p>
+      <w:pPr>
+        <w:pStyle w:val="ListParagraph"/>
+        <w:numPr>
+          <w:ilvl w:val="1"/>
+          <w:numId w:val="14"/>
+        </w:numPr>
+      </w:pPr>
+      <w:r>
+        <w:t xml:space="preserve">Downloads the PDF from </w:t>
+      </w:r>
+      <w:proofErr w:type="spellStart"/>
+      <w:r>
+        <w:t>MinIO</w:t>
+      </w:r>
+      <w:proofErr w:type="spellEnd"/>
+      <w:r>
+        <w:t xml:space="preserve"> using the S3 API.</w:t>
+      </w:r>
+    </w:p>
+    <w:p>
+      <w:pPr>
+        <w:pStyle w:val="ListParagraph"/>
+        <w:numPr>
+          <w:ilvl w:val="1"/>
+          <w:numId w:val="14"/>
+        </w:numPr>
+      </w:pPr>
+      <w:r>
+        <w:t>Runs Tesseract OCR to extract text.</w:t>
+      </w:r>
+    </w:p>
+    <w:p>
+      <w:pPr>
+        <w:pStyle w:val="ListParagraph"/>
+        <w:numPr>
+          <w:ilvl w:val="1"/>
+          <w:numId w:val="14"/>
+        </w:numPr>
+      </w:pPr>
+      <w:r>
+        <w:t xml:space="preserve">Publishes an OCR result message to </w:t>
+      </w:r>
+      <w:proofErr w:type="spellStart"/>
+      <w:r>
+        <w:t>paperless.ocr.results</w:t>
+      </w:r>
+      <w:proofErr w:type="spellEnd"/>
+      <w:r>
+        <w:t>.</w:t>
+      </w:r>
+    </w:p>
+    <w:p>
+      <w:pPr>
         <w:rPr>
           <w:b/>
           <w:bCs/>
         </w:rPr>
-        <w:t>OcrWorkerService</w:t>
-      </w:r>
-      <w:proofErr w:type="spellEnd"/>
-      <w:r>
+      </w:pPr>
+    </w:p>
+    <w:p>
+      <w:pPr>
         <w:rPr>
           <w:b/>
           <w:bCs/>
         </w:rPr>
-        <w:t>)</w:t>
+      </w:pPr>
+      <w:r>
+        <w:rPr>
+          <w:b/>
+          <w:bCs/>
+        </w:rPr>
+        <w:t>SOLID / Clean Code</w:t>
       </w:r>
     </w:p>
     <w:p>
@@ -354,11 +564,71 @@
         <w:pStyle w:val="ListParagraph"/>
         <w:numPr>
           <w:ilvl w:val="0"/>
-          <w:numId w:val="12"/>
+          <w:numId w:val="15"/>
         </w:numPr>
       </w:pPr>
       <w:r>
-        <w:t>Implemented as a hosted service in a dedicated Worker project.</w:t>
+        <w:t>Single Responsibility:</w:t>
+      </w:r>
+    </w:p>
+    <w:p>
+      <w:pPr>
+        <w:pStyle w:val="ListParagraph"/>
+        <w:numPr>
+          <w:ilvl w:val="1"/>
+          <w:numId w:val="15"/>
+        </w:numPr>
+      </w:pPr>
+      <w:proofErr w:type="spellStart"/>
+      <w:r>
+        <w:t>OcrWorkerService</w:t>
+      </w:r>
+      <w:proofErr w:type="spellEnd"/>
+      <w:r>
+        <w:t xml:space="preserve"> handles only message transport and lifecycle.  </w:t>
+      </w:r>
+    </w:p>
+    <w:p>
+      <w:pPr>
+        <w:pStyle w:val="ListParagraph"/>
+        <w:numPr>
+          <w:ilvl w:val="1"/>
+          <w:numId w:val="15"/>
+        </w:numPr>
+      </w:pPr>
+      <w:proofErr w:type="spellStart"/>
+      <w:r>
+        <w:lastRenderedPageBreak/>
+        <w:t>OcrJobHandler</w:t>
+      </w:r>
+      <w:proofErr w:type="spellEnd"/>
+      <w:r>
+        <w:t xml:space="preserve"> encapsulates business logic (download + OCR + result building).  </w:t>
+      </w:r>
+    </w:p>
+    <w:p>
+      <w:pPr>
+        <w:pStyle w:val="ListParagraph"/>
+        <w:numPr>
+          <w:ilvl w:val="1"/>
+          <w:numId w:val="15"/>
+        </w:numPr>
+      </w:pPr>
+      <w:proofErr w:type="spellStart"/>
+      <w:r>
+        <w:t>MinioFileStoreClient</w:t>
+      </w:r>
+      <w:proofErr w:type="spellEnd"/>
+      <w:r>
+        <w:t xml:space="preserve"> and </w:t>
+      </w:r>
+      <w:proofErr w:type="spellStart"/>
+      <w:r>
+        <w:t>TesseractOcrEngine</w:t>
+      </w:r>
+      <w:proofErr w:type="spellEnd"/>
+      <w:r>
+        <w:t xml:space="preserve"> each have one clear responsibility.</w:t>
       </w:r>
     </w:p>
     <w:p>
@@ -366,21 +636,67 @@
         <w:pStyle w:val="ListParagraph"/>
         <w:numPr>
           <w:ilvl w:val="0"/>
-          <w:numId w:val="12"/>
+          <w:numId w:val="15"/>
         </w:numPr>
       </w:pPr>
       <w:r>
-        <w:t xml:space="preserve">Consumes messages from </w:t>
+        <w:t>Dependency Inversion:</w:t>
+      </w:r>
+    </w:p>
+    <w:p>
+      <w:pPr>
+        <w:pStyle w:val="ListParagraph"/>
+        <w:numPr>
+          <w:ilvl w:val="1"/>
+          <w:numId w:val="15"/>
+        </w:numPr>
+      </w:pPr>
+      <w:r>
+        <w:t>High-level workflow depends on interfaces (</w:t>
       </w:r>
       <w:proofErr w:type="spellStart"/>
-      <w:proofErr w:type="gramStart"/>
-      <w:r>
-        <w:t>paperless.ocr.input</w:t>
+      <w:r>
+        <w:t>IOcrJobHandler</w:t>
       </w:r>
       <w:proofErr w:type="spellEnd"/>
-      <w:proofErr w:type="gramEnd"/>
-      <w:r>
-        <w:t xml:space="preserve"> via RabbitMQ.</w:t>
+      <w:r>
+        <w:t xml:space="preserve">, </w:t>
+      </w:r>
+      <w:proofErr w:type="spellStart"/>
+      <w:r>
+        <w:t>IFileStoreClient</w:t>
+      </w:r>
+      <w:proofErr w:type="spellEnd"/>
+      <w:r>
+        <w:t xml:space="preserve">, </w:t>
+      </w:r>
+      <w:proofErr w:type="spellStart"/>
+      <w:r>
+        <w:t>IOcrEngine</w:t>
+      </w:r>
+      <w:proofErr w:type="spellEnd"/>
+      <w:r>
+        <w:t xml:space="preserve">), which are injected via DI.  </w:t>
+      </w:r>
+    </w:p>
+    <w:p>
+      <w:pPr>
+        <w:pStyle w:val="ListParagraph"/>
+        <w:numPr>
+          <w:ilvl w:val="1"/>
+          <w:numId w:val="15"/>
+        </w:numPr>
+      </w:pPr>
+      <w:r>
+        <w:t>Concrete implementations (</w:t>
+      </w:r>
+      <w:proofErr w:type="spellStart"/>
+      <w:r>
+        <w:t>MinIO</w:t>
+      </w:r>
+      <w:proofErr w:type="spellEnd"/>
+      <w:r>
+        <w:t>, Tesseract) can be replaced or mocked for unit tests.</w:t>
       </w:r>
     </w:p>
     <w:p>
@@ -388,134 +704,41 @@
         <w:pStyle w:val="ListParagraph"/>
         <w:numPr>
           <w:ilvl w:val="0"/>
-          <w:numId w:val="12"/>
+          <w:numId w:val="15"/>
         </w:numPr>
       </w:pPr>
       <w:r>
-        <w:t>Uses</w:t>
-      </w:r>
-      <w:r>
-        <w:t xml:space="preserve"> </w:t>
-      </w:r>
-      <w:proofErr w:type="spellStart"/>
-      <w:r>
-        <w:t>IMinioClient</w:t>
-      </w:r>
-      <w:proofErr w:type="spellEnd"/>
-      <w:r>
-        <w:t>/</w:t>
-      </w:r>
-      <w:proofErr w:type="spellStart"/>
-      <w:r>
-        <w:t>IFileStoreClient</w:t>
-      </w:r>
-      <w:proofErr w:type="spellEnd"/>
-      <w:r>
-        <w:t xml:space="preserve"> to download the original PDF from </w:t>
-      </w:r>
-      <w:proofErr w:type="spellStart"/>
-      <w:r>
-        <w:t>MinIO</w:t>
-      </w:r>
-      <w:proofErr w:type="spellEnd"/>
-      <w:r>
-        <w:t>.</w:t>
+        <w:t xml:space="preserve">Testability: </w:t>
       </w:r>
     </w:p>
     <w:p>
       <w:pPr>
         <w:pStyle w:val="ListParagraph"/>
         <w:numPr>
-          <w:ilvl w:val="0"/>
-          <w:numId w:val="12"/>
+          <w:ilvl w:val="1"/>
+          <w:numId w:val="15"/>
         </w:numPr>
       </w:pPr>
       <w:r>
-        <w:t xml:space="preserve">Uses </w:t>
+        <w:t>OCR workflow can be unit-tested by mocking `</w:t>
       </w:r>
       <w:proofErr w:type="spellStart"/>
       <w:r>
+        <w:t>IFileStoreClient</w:t>
+      </w:r>
+      <w:proofErr w:type="spellEnd"/>
+      <w:r>
+        <w:t>` and `</w:t>
+      </w:r>
+      <w:proofErr w:type="spellStart"/>
+      <w:r>
         <w:t>IOcrEngine</w:t>
       </w:r>
       <w:proofErr w:type="spellEnd"/>
       <w:r>
-        <w:t>/Tesseract wrapper to perform OCR on the downloaded file.</w:t>
-      </w:r>
-    </w:p>
-    <w:p>
-      <w:pPr>
-        <w:pStyle w:val="ListParagraph"/>
-        <w:numPr>
-          <w:ilvl w:val="0"/>
-          <w:numId w:val="12"/>
-        </w:numPr>
-      </w:pPr>
-      <w:r>
-        <w:t xml:space="preserve">Builds a </w:t>
-      </w:r>
-      <w:proofErr w:type="spellStart"/>
-      <w:r>
-        <w:t>ResultModel</w:t>
-      </w:r>
-      <w:proofErr w:type="spellEnd"/>
-      <w:r>
-        <w:t xml:space="preserve"> with </w:t>
-      </w:r>
-      <w:proofErr w:type="spellStart"/>
-      <w:r>
-        <w:t>DocumentId</w:t>
-      </w:r>
-      <w:proofErr w:type="spellEnd"/>
-      <w:r>
-        <w:t xml:space="preserve">, Summary, and </w:t>
-      </w:r>
-      <w:proofErr w:type="spellStart"/>
-      <w:r>
-        <w:t>ProcessedA</w:t>
-      </w:r>
-      <w:r>
-        <w:t>t</w:t>
-      </w:r>
-      <w:proofErr w:type="spellEnd"/>
-      <w:r>
-        <w:t>.</w:t>
-      </w:r>
-    </w:p>
-    <w:p>
-      <w:pPr>
-        <w:pStyle w:val="ListParagraph"/>
-        <w:numPr>
-          <w:ilvl w:val="0"/>
-          <w:numId w:val="12"/>
-        </w:numPr>
-      </w:pPr>
-      <w:r>
-        <w:t xml:space="preserve">Publishes the result as JSON to </w:t>
-      </w:r>
-      <w:proofErr w:type="spellStart"/>
-      <w:proofErr w:type="gramStart"/>
-      <w:r>
-        <w:t>paperless.ocr.results</w:t>
-      </w:r>
-      <w:proofErr w:type="spellEnd"/>
-      <w:proofErr w:type="gramEnd"/>
-      <w:r>
-        <w:t>.</w:t>
-      </w:r>
-    </w:p>
-    <w:p>
-      <w:pPr>
-        <w:pStyle w:val="ListParagraph"/>
-        <w:numPr>
-          <w:ilvl w:val="0"/>
-          <w:numId w:val="12"/>
-        </w:numPr>
-      </w:pPr>
-      <w:r>
-        <w:t>Implements ACK/NACK and logging via log4net.</w:t>
-      </w:r>
-    </w:p>
-    <w:p/>
+        <w:t>` without RabbitMQ or real Tesseract.</w:t>
+      </w:r>
+    </w:p>
     <w:p>
       <w:pPr>
         <w:rPr>
@@ -640,7 +863,6 @@
           <w:b/>
           <w:bCs/>
         </w:rPr>
-        <w:lastRenderedPageBreak/>
         <w:t>REST Server</w:t>
       </w:r>
     </w:p>
@@ -986,6 +1208,119 @@
 <file path=word/numbering.xml><?xml version="1.0" encoding="utf-8"?>
 <w:numbering xmlns:wpc="http://schemas.microsoft.com/office/word/2010/wordprocessingCanvas" xmlns:cx="http://schemas.microsoft.com/office/drawing/2014/chartex" xmlns:cx1="http://schemas.microsoft.com/office/drawing/2015/9/8/chartex" xmlns:cx2="http://schemas.microsoft.com/office/drawing/2015/10/21/chartex" xmlns:cx3="http://schemas.microsoft.com/office/drawing/2016/5/9/chartex" xmlns:cx4="http://schemas.microsoft.com/office/drawing/2016/5/10/chartex" xmlns:cx5="http://schemas.microsoft.com/office/drawing/2016/5/11/chartex" xmlns:cx6="http://schemas.microsoft.com/office/drawing/2016/5/12/chartex" xmlns:cx7="http://schemas.microsoft.com/office/drawing/2016/5/13/chartex" xmlns:cx8="http://schemas.microsoft.com/office/drawing/2016/5/14/chartex" xmlns:mc="http://schemas.openxmlformats.org/markup-compatibility/2006" xmlns:aink="http://schemas.microsoft.com/office/drawing/2016/ink" xmlns:am3d="http://schemas.microsoft.com/office/drawing/2017/model3d" xmlns:o="urn:schemas-microsoft-com:office:office" xmlns:oel="http://schemas.microsoft.com/office/2019/extlst" xmlns:r="http://schemas.openxmlformats.org/officeDocument/2006/relationships" xmlns:m="http://schemas.openxmlformats.org/officeDocument/2006/math" xmlns:v="urn:schemas-microsoft-com:vml" xmlns:wp14="http://schemas.microsoft.com/office/word/2010/wordprocessingDrawing" xmlns:wp="http://schemas.openxmlformats.org/drawingml/2006/wordprocessingDrawing" xmlns:w10="urn:schemas-microsoft-com:office:word" xmlns:w="http://schemas.openxmlformats.org/wordprocessingml/2006/main" xmlns:w14="http://schemas.microsoft.com/office/word/2010/wordml" xmlns:w15="http://schemas.microsoft.com/office/word/2012/wordml" xmlns:w16cex="http://schemas.microsoft.com/office/word/2018/wordml/cex" xmlns:w16cid="http://schemas.microsoft.com/office/word/2016/wordml/cid" xmlns:w16="http://schemas.microsoft.com/office/word/2018/wordml" xmlns:w16du="http://schemas.microsoft.com/office/word/2023/wordml/word16du" xmlns:w16sdtdh="http://schemas.microsoft.com/office/word/2020/wordml/sdtdatahash" xmlns:w16sdtfl="http://schemas.microsoft.com/office/word/2024/wordml/sdtformatlock" xmlns:w16se="http://schemas.microsoft.com/office/word/2015/wordml/symex" xmlns:wpg="http://schemas.microsoft.com/office/word/2010/wordprocessingGroup" xmlns:wpi="http://schemas.microsoft.com/office/word/2010/wordprocessingInk" xmlns:wne="http://schemas.microsoft.com/office/word/2006/wordml" xmlns:wps="http://schemas.microsoft.com/office/word/2010/wordprocessingShape" mc:Ignorable="w14 w15 w16se w16cid w16 w16cex w16sdtdh w16sdtfl w16du wp14">
   <w:abstractNum w:abstractNumId="0" w15:restartNumberingAfterBreak="0">
+    <w:nsid w:val="04571AF3"/>
+    <w:multiLevelType w:val="hybridMultilevel"/>
+    <w:tmpl w:val="1116C66A"/>
+    <w:lvl w:ilvl="0" w:tplc="20000001">
+      <w:start w:val="1"/>
+      <w:numFmt w:val="bullet"/>
+      <w:lvlText w:val=""/>
+      <w:lvlJc w:val="left"/>
+      <w:pPr>
+        <w:ind w:left="720" w:hanging="360"/>
+      </w:pPr>
+      <w:rPr>
+        <w:rFonts w:ascii="Symbol" w:hAnsi="Symbol" w:hint="default"/>
+      </w:rPr>
+    </w:lvl>
+    <w:lvl w:ilvl="1" w:tplc="20000003" w:tentative="1">
+      <w:start w:val="1"/>
+      <w:numFmt w:val="bullet"/>
+      <w:lvlText w:val="o"/>
+      <w:lvlJc w:val="left"/>
+      <w:pPr>
+        <w:ind w:left="1440" w:hanging="360"/>
+      </w:pPr>
+      <w:rPr>
+        <w:rFonts w:ascii="Courier New" w:hAnsi="Courier New" w:cs="Courier New" w:hint="default"/>
+      </w:rPr>
+    </w:lvl>
+    <w:lvl w:ilvl="2" w:tplc="20000005" w:tentative="1">
+      <w:start w:val="1"/>
+      <w:numFmt w:val="bullet"/>
+      <w:lvlText w:val=""/>
+      <w:lvlJc w:val="left"/>
+      <w:pPr>
+        <w:ind w:left="2160" w:hanging="360"/>
+      </w:pPr>
+      <w:rPr>
+        <w:rFonts w:ascii="Wingdings" w:hAnsi="Wingdings" w:hint="default"/>
+      </w:rPr>
+    </w:lvl>
+    <w:lvl w:ilvl="3" w:tplc="20000001" w:tentative="1">
+      <w:start w:val="1"/>
+      <w:numFmt w:val="bullet"/>
+      <w:lvlText w:val=""/>
+      <w:lvlJc w:val="left"/>
+      <w:pPr>
+        <w:ind w:left="2880" w:hanging="360"/>
+      </w:pPr>
+      <w:rPr>
+        <w:rFonts w:ascii="Symbol" w:hAnsi="Symbol" w:hint="default"/>
+      </w:rPr>
+    </w:lvl>
+    <w:lvl w:ilvl="4" w:tplc="20000003" w:tentative="1">
+      <w:start w:val="1"/>
+      <w:numFmt w:val="bullet"/>
+      <w:lvlText w:val="o"/>
+      <w:lvlJc w:val="left"/>
+      <w:pPr>
+        <w:ind w:left="3600" w:hanging="360"/>
+      </w:pPr>
+      <w:rPr>
+        <w:rFonts w:ascii="Courier New" w:hAnsi="Courier New" w:cs="Courier New" w:hint="default"/>
+      </w:rPr>
+    </w:lvl>
+    <w:lvl w:ilvl="5" w:tplc="20000005" w:tentative="1">
+      <w:start w:val="1"/>
+      <w:numFmt w:val="bullet"/>
+      <w:lvlText w:val=""/>
+      <w:lvlJc w:val="left"/>
+      <w:pPr>
+        <w:ind w:left="4320" w:hanging="360"/>
+      </w:pPr>
+      <w:rPr>
+        <w:rFonts w:ascii="Wingdings" w:hAnsi="Wingdings" w:hint="default"/>
+      </w:rPr>
+    </w:lvl>
+    <w:lvl w:ilvl="6" w:tplc="20000001" w:tentative="1">
+      <w:start w:val="1"/>
+      <w:numFmt w:val="bullet"/>
+      <w:lvlText w:val=""/>
+      <w:lvlJc w:val="left"/>
+      <w:pPr>
+        <w:ind w:left="5040" w:hanging="360"/>
+      </w:pPr>
+      <w:rPr>
+        <w:rFonts w:ascii="Symbol" w:hAnsi="Symbol" w:hint="default"/>
+      </w:rPr>
+    </w:lvl>
+    <w:lvl w:ilvl="7" w:tplc="20000003" w:tentative="1">
+      <w:start w:val="1"/>
+      <w:numFmt w:val="bullet"/>
+      <w:lvlText w:val="o"/>
+      <w:lvlJc w:val="left"/>
+      <w:pPr>
+        <w:ind w:left="5760" w:hanging="360"/>
+      </w:pPr>
+      <w:rPr>
+        <w:rFonts w:ascii="Courier New" w:hAnsi="Courier New" w:cs="Courier New" w:hint="default"/>
+      </w:rPr>
+    </w:lvl>
+    <w:lvl w:ilvl="8" w:tplc="20000005" w:tentative="1">
+      <w:start w:val="1"/>
+      <w:numFmt w:val="bullet"/>
+      <w:lvlText w:val=""/>
+      <w:lvlJc w:val="left"/>
+      <w:pPr>
+        <w:ind w:left="6480" w:hanging="360"/>
+      </w:pPr>
+      <w:rPr>
+        <w:rFonts w:ascii="Wingdings" w:hAnsi="Wingdings" w:hint="default"/>
+      </w:rPr>
+    </w:lvl>
+  </w:abstractNum>
+  <w:abstractNum w:abstractNumId="1" w15:restartNumberingAfterBreak="0">
     <w:nsid w:val="28EB7134"/>
     <w:multiLevelType w:val="hybridMultilevel"/>
     <w:tmpl w:val="68C499D2"/>
@@ -1098,7 +1433,7 @@
       </w:rPr>
     </w:lvl>
   </w:abstractNum>
-  <w:abstractNum w:abstractNumId="1" w15:restartNumberingAfterBreak="0">
+  <w:abstractNum w:abstractNumId="2" w15:restartNumberingAfterBreak="0">
     <w:nsid w:val="3C171079"/>
     <w:multiLevelType w:val="hybridMultilevel"/>
     <w:tmpl w:val="602848B8"/>
@@ -1184,7 +1519,7 @@
       </w:pPr>
     </w:lvl>
   </w:abstractNum>
-  <w:abstractNum w:abstractNumId="2" w15:restartNumberingAfterBreak="0">
+  <w:abstractNum w:abstractNumId="3" w15:restartNumberingAfterBreak="0">
     <w:nsid w:val="3D6E53E9"/>
     <w:multiLevelType w:val="hybridMultilevel"/>
     <w:tmpl w:val="D78EFCC2"/>
@@ -1270,7 +1605,120 @@
       </w:pPr>
     </w:lvl>
   </w:abstractNum>
-  <w:abstractNum w:abstractNumId="3" w15:restartNumberingAfterBreak="0">
+  <w:abstractNum w:abstractNumId="4" w15:restartNumberingAfterBreak="0">
+    <w:nsid w:val="3DBB7168"/>
+    <w:multiLevelType w:val="hybridMultilevel"/>
+    <w:tmpl w:val="18CEE80E"/>
+    <w:lvl w:ilvl="0" w:tplc="2000000F">
+      <w:start w:val="1"/>
+      <w:numFmt w:val="decimal"/>
+      <w:lvlText w:val="%1."/>
+      <w:lvlJc w:val="left"/>
+      <w:pPr>
+        <w:ind w:left="720" w:hanging="360"/>
+      </w:pPr>
+      <w:rPr>
+        <w:rFonts w:hint="default"/>
+      </w:rPr>
+    </w:lvl>
+    <w:lvl w:ilvl="1" w:tplc="FFFFFFFF">
+      <w:start w:val="1"/>
+      <w:numFmt w:val="bullet"/>
+      <w:lvlText w:val="o"/>
+      <w:lvlJc w:val="left"/>
+      <w:pPr>
+        <w:ind w:left="1440" w:hanging="360"/>
+      </w:pPr>
+      <w:rPr>
+        <w:rFonts w:ascii="Courier New" w:hAnsi="Courier New" w:cs="Courier New" w:hint="default"/>
+      </w:rPr>
+    </w:lvl>
+    <w:lvl w:ilvl="2" w:tplc="FFFFFFFF" w:tentative="1">
+      <w:start w:val="1"/>
+      <w:numFmt w:val="bullet"/>
+      <w:lvlText w:val=""/>
+      <w:lvlJc w:val="left"/>
+      <w:pPr>
+        <w:ind w:left="2160" w:hanging="360"/>
+      </w:pPr>
+      <w:rPr>
+        <w:rFonts w:ascii="Wingdings" w:hAnsi="Wingdings" w:hint="default"/>
+      </w:rPr>
+    </w:lvl>
+    <w:lvl w:ilvl="3" w:tplc="FFFFFFFF" w:tentative="1">
+      <w:start w:val="1"/>
+      <w:numFmt w:val="bullet"/>
+      <w:lvlText w:val=""/>
+      <w:lvlJc w:val="left"/>
+      <w:pPr>
+        <w:ind w:left="2880" w:hanging="360"/>
+      </w:pPr>
+      <w:rPr>
+        <w:rFonts w:ascii="Symbol" w:hAnsi="Symbol" w:hint="default"/>
+      </w:rPr>
+    </w:lvl>
+    <w:lvl w:ilvl="4" w:tplc="FFFFFFFF" w:tentative="1">
+      <w:start w:val="1"/>
+      <w:numFmt w:val="bullet"/>
+      <w:lvlText w:val="o"/>
+      <w:lvlJc w:val="left"/>
+      <w:pPr>
+        <w:ind w:left="3600" w:hanging="360"/>
+      </w:pPr>
+      <w:rPr>
+        <w:rFonts w:ascii="Courier New" w:hAnsi="Courier New" w:cs="Courier New" w:hint="default"/>
+      </w:rPr>
+    </w:lvl>
+    <w:lvl w:ilvl="5" w:tplc="FFFFFFFF" w:tentative="1">
+      <w:start w:val="1"/>
+      <w:numFmt w:val="bullet"/>
+      <w:lvlText w:val=""/>
+      <w:lvlJc w:val="left"/>
+      <w:pPr>
+        <w:ind w:left="4320" w:hanging="360"/>
+      </w:pPr>
+      <w:rPr>
+        <w:rFonts w:ascii="Wingdings" w:hAnsi="Wingdings" w:hint="default"/>
+      </w:rPr>
+    </w:lvl>
+    <w:lvl w:ilvl="6" w:tplc="FFFFFFFF" w:tentative="1">
+      <w:start w:val="1"/>
+      <w:numFmt w:val="bullet"/>
+      <w:lvlText w:val=""/>
+      <w:lvlJc w:val="left"/>
+      <w:pPr>
+        <w:ind w:left="5040" w:hanging="360"/>
+      </w:pPr>
+      <w:rPr>
+        <w:rFonts w:ascii="Symbol" w:hAnsi="Symbol" w:hint="default"/>
+      </w:rPr>
+    </w:lvl>
+    <w:lvl w:ilvl="7" w:tplc="FFFFFFFF" w:tentative="1">
+      <w:start w:val="1"/>
+      <w:numFmt w:val="bullet"/>
+      <w:lvlText w:val="o"/>
+      <w:lvlJc w:val="left"/>
+      <w:pPr>
+        <w:ind w:left="5760" w:hanging="360"/>
+      </w:pPr>
+      <w:rPr>
+        <w:rFonts w:ascii="Courier New" w:hAnsi="Courier New" w:cs="Courier New" w:hint="default"/>
+      </w:rPr>
+    </w:lvl>
+    <w:lvl w:ilvl="8" w:tplc="FFFFFFFF" w:tentative="1">
+      <w:start w:val="1"/>
+      <w:numFmt w:val="bullet"/>
+      <w:lvlText w:val=""/>
+      <w:lvlJc w:val="left"/>
+      <w:pPr>
+        <w:ind w:left="6480" w:hanging="360"/>
+      </w:pPr>
+      <w:rPr>
+        <w:rFonts w:ascii="Wingdings" w:hAnsi="Wingdings" w:hint="default"/>
+      </w:rPr>
+    </w:lvl>
+  </w:abstractNum>
+  <w:abstractNum w:abstractNumId="5" w15:restartNumberingAfterBreak="0">
     <w:nsid w:val="440779FE"/>
     <w:multiLevelType w:val="hybridMultilevel"/>
     <w:tmpl w:val="C7B63102"/>
@@ -1383,7 +1831,7 @@
       </w:rPr>
     </w:lvl>
   </w:abstractNum>
-  <w:abstractNum w:abstractNumId="4" w15:restartNumberingAfterBreak="0">
+  <w:abstractNum w:abstractNumId="6" w15:restartNumberingAfterBreak="0">
     <w:nsid w:val="49883CF7"/>
     <w:multiLevelType w:val="hybridMultilevel"/>
     <w:tmpl w:val="2F808CDA"/>
@@ -1496,7 +1944,120 @@
       </w:rPr>
     </w:lvl>
   </w:abstractNum>
-  <w:abstractNum w:abstractNumId="5" w15:restartNumberingAfterBreak="0">
+  <w:abstractNum w:abstractNumId="7" w15:restartNumberingAfterBreak="0">
+    <w:nsid w:val="4A0F5D00"/>
+    <w:multiLevelType w:val="hybridMultilevel"/>
+    <w:tmpl w:val="018A5776"/>
+    <w:lvl w:ilvl="0" w:tplc="20000001">
+      <w:start w:val="1"/>
+      <w:numFmt w:val="bullet"/>
+      <w:lvlText w:val=""/>
+      <w:lvlJc w:val="left"/>
+      <w:pPr>
+        <w:ind w:left="720" w:hanging="360"/>
+      </w:pPr>
+      <w:rPr>
+        <w:rFonts w:ascii="Symbol" w:hAnsi="Symbol" w:hint="default"/>
+      </w:rPr>
+    </w:lvl>
+    <w:lvl w:ilvl="1" w:tplc="20000003">
+      <w:start w:val="1"/>
+      <w:numFmt w:val="bullet"/>
+      <w:lvlText w:val="o"/>
+      <w:lvlJc w:val="left"/>
+      <w:pPr>
+        <w:ind w:left="1440" w:hanging="360"/>
+      </w:pPr>
+      <w:rPr>
+        <w:rFonts w:ascii="Courier New" w:hAnsi="Courier New" w:cs="Courier New" w:hint="default"/>
+      </w:rPr>
+    </w:lvl>
+    <w:lvl w:ilvl="2" w:tplc="20000005" w:tentative="1">
+      <w:start w:val="1"/>
+      <w:numFmt w:val="bullet"/>
+      <w:lvlText w:val=""/>
+      <w:lvlJc w:val="left"/>
+      <w:pPr>
+        <w:ind w:left="2160" w:hanging="360"/>
+      </w:pPr>
+      <w:rPr>
+        <w:rFonts w:ascii="Wingdings" w:hAnsi="Wingdings" w:hint="default"/>
+      </w:rPr>
+    </w:lvl>
+    <w:lvl w:ilvl="3" w:tplc="20000001" w:tentative="1">
+      <w:start w:val="1"/>
+      <w:numFmt w:val="bullet"/>
+      <w:lvlText w:val=""/>
+      <w:lvlJc w:val="left"/>
+      <w:pPr>
+        <w:ind w:left="2880" w:hanging="360"/>
+      </w:pPr>
+      <w:rPr>
+        <w:rFonts w:ascii="Symbol" w:hAnsi="Symbol" w:hint="default"/>
+      </w:rPr>
+    </w:lvl>
+    <w:lvl w:ilvl="4" w:tplc="20000003" w:tentative="1">
+      <w:start w:val="1"/>
+      <w:numFmt w:val="bullet"/>
+      <w:lvlText w:val="o"/>
+      <w:lvlJc w:val="left"/>
+      <w:pPr>
+        <w:ind w:left="3600" w:hanging="360"/>
+      </w:pPr>
+      <w:rPr>
+        <w:rFonts w:ascii="Courier New" w:hAnsi="Courier New" w:cs="Courier New" w:hint="default"/>
+      </w:rPr>
+    </w:lvl>
+    <w:lvl w:ilvl="5" w:tplc="20000005" w:tentative="1">
+      <w:start w:val="1"/>
+      <w:numFmt w:val="bullet"/>
+      <w:lvlText w:val=""/>
+      <w:lvlJc w:val="left"/>
+      <w:pPr>
+        <w:ind w:left="4320" w:hanging="360"/>
+      </w:pPr>
+      <w:rPr>
+        <w:rFonts w:ascii="Wingdings" w:hAnsi="Wingdings" w:hint="default"/>
+      </w:rPr>
+    </w:lvl>
+    <w:lvl w:ilvl="6" w:tplc="20000001" w:tentative="1">
+      <w:start w:val="1"/>
+      <w:numFmt w:val="bullet"/>
+      <w:lvlText w:val=""/>
+      <w:lvlJc w:val="left"/>
+      <w:pPr>
+        <w:ind w:left="5040" w:hanging="360"/>
+      </w:pPr>
+      <w:rPr>
+        <w:rFonts w:ascii="Symbol" w:hAnsi="Symbol" w:hint="default"/>
+      </w:rPr>
+    </w:lvl>
+    <w:lvl w:ilvl="7" w:tplc="20000003" w:tentative="1">
+      <w:start w:val="1"/>
+      <w:numFmt w:val="bullet"/>
+      <w:lvlText w:val="o"/>
+      <w:lvlJc w:val="left"/>
+      <w:pPr>
+        <w:ind w:left="5760" w:hanging="360"/>
+      </w:pPr>
+      <w:rPr>
+        <w:rFonts w:ascii="Courier New" w:hAnsi="Courier New" w:cs="Courier New" w:hint="default"/>
+      </w:rPr>
+    </w:lvl>
+    <w:lvl w:ilvl="8" w:tplc="20000005" w:tentative="1">
+      <w:start w:val="1"/>
+      <w:numFmt w:val="bullet"/>
+      <w:lvlText w:val=""/>
+      <w:lvlJc w:val="left"/>
+      <w:pPr>
+        <w:ind w:left="6480" w:hanging="360"/>
+      </w:pPr>
+      <w:rPr>
+        <w:rFonts w:ascii="Wingdings" w:hAnsi="Wingdings" w:hint="default"/>
+      </w:rPr>
+    </w:lvl>
+  </w:abstractNum>
+  <w:abstractNum w:abstractNumId="8" w15:restartNumberingAfterBreak="0">
     <w:nsid w:val="4B3D1744"/>
     <w:multiLevelType w:val="hybridMultilevel"/>
     <w:tmpl w:val="5FACA96A"/>
@@ -1582,7 +2143,7 @@
       </w:pPr>
     </w:lvl>
   </w:abstractNum>
-  <w:abstractNum w:abstractNumId="6" w15:restartNumberingAfterBreak="0">
+  <w:abstractNum w:abstractNumId="9" w15:restartNumberingAfterBreak="0">
     <w:nsid w:val="4D1E4DF5"/>
     <w:multiLevelType w:val="hybridMultilevel"/>
     <w:tmpl w:val="A496BA9E"/>
@@ -1695,7 +2256,7 @@
       </w:rPr>
     </w:lvl>
   </w:abstractNum>
-  <w:abstractNum w:abstractNumId="7" w15:restartNumberingAfterBreak="0">
+  <w:abstractNum w:abstractNumId="10" w15:restartNumberingAfterBreak="0">
     <w:nsid w:val="4D3A65D6"/>
     <w:multiLevelType w:val="hybridMultilevel"/>
     <w:tmpl w:val="242885FA"/>
@@ -1808,7 +2369,7 @@
       </w:rPr>
     </w:lvl>
   </w:abstractNum>
-  <w:abstractNum w:abstractNumId="8" w15:restartNumberingAfterBreak="0">
+  <w:abstractNum w:abstractNumId="11" w15:restartNumberingAfterBreak="0">
     <w:nsid w:val="500812A4"/>
     <w:multiLevelType w:val="hybridMultilevel"/>
     <w:tmpl w:val="953EFC1A"/>
@@ -1921,7 +2482,7 @@
       </w:rPr>
     </w:lvl>
   </w:abstractNum>
-  <w:abstractNum w:abstractNumId="9" w15:restartNumberingAfterBreak="0">
+  <w:abstractNum w:abstractNumId="12" w15:restartNumberingAfterBreak="0">
     <w:nsid w:val="518654DC"/>
     <w:multiLevelType w:val="hybridMultilevel"/>
     <w:tmpl w:val="6EEA7636"/>
@@ -2007,7 +2568,7 @@
       </w:pPr>
     </w:lvl>
   </w:abstractNum>
-  <w:abstractNum w:abstractNumId="10" w15:restartNumberingAfterBreak="0">
+  <w:abstractNum w:abstractNumId="13" w15:restartNumberingAfterBreak="0">
     <w:nsid w:val="70124390"/>
     <w:multiLevelType w:val="hybridMultilevel"/>
     <w:tmpl w:val="714CE7A8"/>
@@ -2120,7 +2681,7 @@
       </w:rPr>
     </w:lvl>
   </w:abstractNum>
-  <w:abstractNum w:abstractNumId="11" w15:restartNumberingAfterBreak="0">
+  <w:abstractNum w:abstractNumId="14" w15:restartNumberingAfterBreak="0">
     <w:nsid w:val="7C9A6AFB"/>
     <w:multiLevelType w:val="hybridMultilevel"/>
     <w:tmpl w:val="CBF4D3E2"/>
@@ -2234,40 +2795,49 @@
     </w:lvl>
   </w:abstractNum>
   <w:num w:numId="1" w16cid:durableId="1615406813">
+    <w:abstractNumId w:val="1"/>
+  </w:num>
+  <w:num w:numId="2" w16cid:durableId="1607076917">
+    <w:abstractNumId w:val="13"/>
+  </w:num>
+  <w:num w:numId="3" w16cid:durableId="547883308">
+    <w:abstractNumId w:val="14"/>
+  </w:num>
+  <w:num w:numId="4" w16cid:durableId="1159540764">
+    <w:abstractNumId w:val="10"/>
+  </w:num>
+  <w:num w:numId="5" w16cid:durableId="62263969">
+    <w:abstractNumId w:val="11"/>
+  </w:num>
+  <w:num w:numId="6" w16cid:durableId="1698197646">
+    <w:abstractNumId w:val="5"/>
+  </w:num>
+  <w:num w:numId="7" w16cid:durableId="1455716257">
+    <w:abstractNumId w:val="2"/>
+  </w:num>
+  <w:num w:numId="8" w16cid:durableId="1248733404">
+    <w:abstractNumId w:val="6"/>
+  </w:num>
+  <w:num w:numId="9" w16cid:durableId="1848715268">
+    <w:abstractNumId w:val="9"/>
+  </w:num>
+  <w:num w:numId="10" w16cid:durableId="1419139022">
+    <w:abstractNumId w:val="8"/>
+  </w:num>
+  <w:num w:numId="11" w16cid:durableId="152109467">
+    <w:abstractNumId w:val="12"/>
+  </w:num>
+  <w:num w:numId="12" w16cid:durableId="361053682">
+    <w:abstractNumId w:val="3"/>
+  </w:num>
+  <w:num w:numId="13" w16cid:durableId="2085300736">
     <w:abstractNumId w:val="0"/>
   </w:num>
-  <w:num w:numId="2" w16cid:durableId="1607076917">
-    <w:abstractNumId w:val="10"/>
-  </w:num>
-  <w:num w:numId="3" w16cid:durableId="547883308">
-    <w:abstractNumId w:val="11"/>
-  </w:num>
-  <w:num w:numId="4" w16cid:durableId="1159540764">
-    <w:abstractNumId w:val="7"/>
-  </w:num>
-  <w:num w:numId="5" w16cid:durableId="62263969">
-    <w:abstractNumId w:val="8"/>
-  </w:num>
-  <w:num w:numId="6" w16cid:durableId="1698197646">
-    <w:abstractNumId w:val="3"/>
-  </w:num>
-  <w:num w:numId="7" w16cid:durableId="1455716257">
-    <w:abstractNumId w:val="1"/>
-  </w:num>
-  <w:num w:numId="8" w16cid:durableId="1248733404">
+  <w:num w:numId="14" w16cid:durableId="1752005099">
     <w:abstractNumId w:val="4"/>
   </w:num>
-  <w:num w:numId="9" w16cid:durableId="1848715268">
-    <w:abstractNumId w:val="6"/>
-  </w:num>
-  <w:num w:numId="10" w16cid:durableId="1419139022">
-    <w:abstractNumId w:val="5"/>
-  </w:num>
-  <w:num w:numId="11" w16cid:durableId="152109467">
-    <w:abstractNumId w:val="9"/>
-  </w:num>
-  <w:num w:numId="12" w16cid:durableId="361053682">
-    <w:abstractNumId w:val="2"/>
+  <w:num w:numId="15" w16cid:durableId="1516190411">
+    <w:abstractNumId w:val="7"/>
   </w:num>
 </w:numbering>
 </file>

</xml_diff>

<commit_message>
44 - Updated documentation
</commit_message>
<xml_diff>
--- a/documentation/Sprint4.docx
+++ b/documentation/Sprint4.docx
@@ -98,19 +98,7 @@
         <w:t>Sprint duration</w:t>
       </w:r>
       <w:r>
-        <w:t>:</w:t>
-      </w:r>
-      <w:r>
-        <w:t xml:space="preserve"> 20</w:t>
-      </w:r>
-      <w:r>
-        <w:t>.11.2025 –</w:t>
-      </w:r>
-      <w:r>
-        <w:t xml:space="preserve"> 27</w:t>
-      </w:r>
-      <w:r>
-        <w:t>.11.2025</w:t>
+        <w:t>: 20.11.2025 – 27.11.2025</w:t>
       </w:r>
     </w:p>
     <w:p>
@@ -845,6 +833,46 @@
     </w:p>
     <w:p>
       <w:pPr>
+        <w:pStyle w:val="ListParagraph"/>
+        <w:numPr>
+          <w:ilvl w:val="0"/>
+          <w:numId w:val="11"/>
+        </w:numPr>
+      </w:pPr>
+      <w:r>
+        <w:t xml:space="preserve">Integrated fetching from </w:t>
+      </w:r>
+      <w:proofErr w:type="spellStart"/>
+      <w:r>
+        <w:t>MinIO</w:t>
+      </w:r>
+      <w:proofErr w:type="spellEnd"/>
+      <w:r>
+        <w:t xml:space="preserve"> into OCR Worker to allow summary generation</w:t>
+      </w:r>
+    </w:p>
+    <w:p>
+      <w:pPr>
+        <w:pStyle w:val="ListParagraph"/>
+        <w:numPr>
+          <w:ilvl w:val="0"/>
+          <w:numId w:val="11"/>
+        </w:numPr>
+      </w:pPr>
+      <w:r>
+        <w:t xml:space="preserve">Integrated fetching from </w:t>
+      </w:r>
+      <w:proofErr w:type="spellStart"/>
+      <w:r>
+        <w:t>MinIO</w:t>
+      </w:r>
+      <w:proofErr w:type="spellEnd"/>
+      <w:r>
+        <w:t xml:space="preserve"> into REST and Frontend to allow download of stored files</w:t>
+      </w:r>
+    </w:p>
+    <w:p>
+      <w:pPr>
         <w:rPr>
           <w:b/>
           <w:bCs/>
@@ -955,9 +983,59 @@
         <w:t>.</w:t>
       </w:r>
     </w:p>
+    <w:p>
+      <w:pPr>
+        <w:pStyle w:val="ListParagraph"/>
+        <w:numPr>
+          <w:ilvl w:val="0"/>
+          <w:numId w:val="10"/>
+        </w:numPr>
+      </w:pPr>
+      <w:r>
+        <w:t>Added endpoint for file download</w:t>
+      </w:r>
+    </w:p>
     <w:p/>
     <w:p>
-      <w:r>
+      <w:pPr>
+        <w:rPr>
+          <w:b/>
+          <w:bCs/>
+        </w:rPr>
+      </w:pPr>
+      <w:r>
+        <w:rPr>
+          <w:b/>
+          <w:bCs/>
+        </w:rPr>
+        <w:t>Quasar Frontend</w:t>
+      </w:r>
+    </w:p>
+    <w:p>
+      <w:pPr>
+        <w:pStyle w:val="ListParagraph"/>
+        <w:numPr>
+          <w:ilvl w:val="0"/>
+          <w:numId w:val="16"/>
+        </w:numPr>
+      </w:pPr>
+      <w:r>
+        <w:t>Added download button and relevant methods for sending request to REST</w:t>
+      </w:r>
+    </w:p>
+    <w:p/>
+    <w:p>
+      <w:pPr>
+        <w:rPr>
+          <w:b/>
+          <w:bCs/>
+        </w:rPr>
+      </w:pPr>
+      <w:r>
+        <w:rPr>
+          <w:b/>
+          <w:bCs/>
+        </w:rPr>
         <w:t>Testing</w:t>
       </w:r>
     </w:p>
@@ -985,6 +1063,7 @@
         </w:numPr>
       </w:pPr>
       <w:r>
+        <w:lastRenderedPageBreak/>
         <w:t xml:space="preserve">OCR Worker’s processing logic (given a message, calls </w:t>
       </w:r>
       <w:proofErr w:type="spellStart"/>
@@ -1123,10 +1202,7 @@
               </w:rPr>
             </w:pPr>
             <w:r>
-              <w:t xml:space="preserve">Sprint </w:t>
-            </w:r>
-            <w:r>
-              <w:t>4</w:t>
+              <w:t>Sprint 4</w:t>
             </w:r>
           </w:p>
         </w:tc>
@@ -1136,7 +1212,10 @@
           </w:tcPr>
           <w:p>
             <w:r>
-              <w:t>12</w:t>
+              <w:t>1</w:t>
+            </w:r>
+            <w:r>
+              <w:t>0</w:t>
             </w:r>
           </w:p>
         </w:tc>
@@ -1147,6 +1226,17 @@
           <w:p>
             <w:r>
               <w:t>docker-compose</w:t>
+            </w:r>
+            <w:r>
+              <w:t xml:space="preserve">, Frontend, </w:t>
+            </w:r>
+            <w:proofErr w:type="spellStart"/>
+            <w:r>
+              <w:t>MinIO</w:t>
+            </w:r>
+            <w:proofErr w:type="spellEnd"/>
+            <w:r>
+              <w:t>, REST</w:t>
             </w:r>
           </w:p>
         </w:tc>
@@ -1168,10 +1258,7 @@
           </w:tcPr>
           <w:p>
             <w:r>
-              <w:t xml:space="preserve">Sprint </w:t>
-            </w:r>
-            <w:r>
-              <w:t>4</w:t>
+              <w:t>Sprint 4</w:t>
             </w:r>
           </w:p>
         </w:tc>
@@ -1181,7 +1268,10 @@
           </w:tcPr>
           <w:p>
             <w:r>
-              <w:t>12</w:t>
+              <w:t>1</w:t>
+            </w:r>
+            <w:r>
+              <w:t>0</w:t>
             </w:r>
           </w:p>
         </w:tc>
@@ -1189,7 +1279,16 @@
           <w:tcPr>
             <w:tcW w:w="2266" w:type="dxa"/>
           </w:tcPr>
-          <w:p/>
+          <w:p>
+            <w:r>
+              <w:t xml:space="preserve">OCR Worker, Tesseract &amp; </w:t>
+            </w:r>
+            <w:proofErr w:type="spellStart"/>
+            <w:r>
+              <w:t>Ghostscript</w:t>
+            </w:r>
+            <w:proofErr w:type="spellEnd"/>
+          </w:p>
         </w:tc>
       </w:tr>
     </w:tbl>
@@ -1321,6 +1420,95 @@
     </w:lvl>
   </w:abstractNum>
   <w:abstractNum w:abstractNumId="1" w15:restartNumberingAfterBreak="0">
+    <w:nsid w:val="066C0653"/>
+    <w:multiLevelType w:val="hybridMultilevel"/>
+    <w:tmpl w:val="9976A810"/>
+    <w:lvl w:ilvl="0" w:tplc="2000000F">
+      <w:start w:val="1"/>
+      <w:numFmt w:val="decimal"/>
+      <w:lvlText w:val="%1."/>
+      <w:lvlJc w:val="left"/>
+      <w:pPr>
+        <w:ind w:left="720" w:hanging="360"/>
+      </w:pPr>
+      <w:rPr>
+        <w:rFonts w:hint="default"/>
+      </w:rPr>
+    </w:lvl>
+    <w:lvl w:ilvl="1" w:tplc="20000019" w:tentative="1">
+      <w:start w:val="1"/>
+      <w:numFmt w:val="lowerLetter"/>
+      <w:lvlText w:val="%2."/>
+      <w:lvlJc w:val="left"/>
+      <w:pPr>
+        <w:ind w:left="1440" w:hanging="360"/>
+      </w:pPr>
+    </w:lvl>
+    <w:lvl w:ilvl="2" w:tplc="2000001B" w:tentative="1">
+      <w:start w:val="1"/>
+      <w:numFmt w:val="lowerRoman"/>
+      <w:lvlText w:val="%3."/>
+      <w:lvlJc w:val="right"/>
+      <w:pPr>
+        <w:ind w:left="2160" w:hanging="180"/>
+      </w:pPr>
+    </w:lvl>
+    <w:lvl w:ilvl="3" w:tplc="2000000F" w:tentative="1">
+      <w:start w:val="1"/>
+      <w:numFmt w:val="decimal"/>
+      <w:lvlText w:val="%4."/>
+      <w:lvlJc w:val="left"/>
+      <w:pPr>
+        <w:ind w:left="2880" w:hanging="360"/>
+      </w:pPr>
+    </w:lvl>
+    <w:lvl w:ilvl="4" w:tplc="20000019" w:tentative="1">
+      <w:start w:val="1"/>
+      <w:numFmt w:val="lowerLetter"/>
+      <w:lvlText w:val="%5."/>
+      <w:lvlJc w:val="left"/>
+      <w:pPr>
+        <w:ind w:left="3600" w:hanging="360"/>
+      </w:pPr>
+    </w:lvl>
+    <w:lvl w:ilvl="5" w:tplc="2000001B" w:tentative="1">
+      <w:start w:val="1"/>
+      <w:numFmt w:val="lowerRoman"/>
+      <w:lvlText w:val="%6."/>
+      <w:lvlJc w:val="right"/>
+      <w:pPr>
+        <w:ind w:left="4320" w:hanging="180"/>
+      </w:pPr>
+    </w:lvl>
+    <w:lvl w:ilvl="6" w:tplc="2000000F" w:tentative="1">
+      <w:start w:val="1"/>
+      <w:numFmt w:val="decimal"/>
+      <w:lvlText w:val="%7."/>
+      <w:lvlJc w:val="left"/>
+      <w:pPr>
+        <w:ind w:left="5040" w:hanging="360"/>
+      </w:pPr>
+    </w:lvl>
+    <w:lvl w:ilvl="7" w:tplc="20000019" w:tentative="1">
+      <w:start w:val="1"/>
+      <w:numFmt w:val="lowerLetter"/>
+      <w:lvlText w:val="%8."/>
+      <w:lvlJc w:val="left"/>
+      <w:pPr>
+        <w:ind w:left="5760" w:hanging="360"/>
+      </w:pPr>
+    </w:lvl>
+    <w:lvl w:ilvl="8" w:tplc="2000001B" w:tentative="1">
+      <w:start w:val="1"/>
+      <w:numFmt w:val="lowerRoman"/>
+      <w:lvlText w:val="%9."/>
+      <w:lvlJc w:val="right"/>
+      <w:pPr>
+        <w:ind w:left="6480" w:hanging="180"/>
+      </w:pPr>
+    </w:lvl>
+  </w:abstractNum>
+  <w:abstractNum w:abstractNumId="2" w15:restartNumberingAfterBreak="0">
     <w:nsid w:val="28EB7134"/>
     <w:multiLevelType w:val="hybridMultilevel"/>
     <w:tmpl w:val="68C499D2"/>
@@ -1433,7 +1621,7 @@
       </w:rPr>
     </w:lvl>
   </w:abstractNum>
-  <w:abstractNum w:abstractNumId="2" w15:restartNumberingAfterBreak="0">
+  <w:abstractNum w:abstractNumId="3" w15:restartNumberingAfterBreak="0">
     <w:nsid w:val="3C171079"/>
     <w:multiLevelType w:val="hybridMultilevel"/>
     <w:tmpl w:val="602848B8"/>
@@ -1519,7 +1707,7 @@
       </w:pPr>
     </w:lvl>
   </w:abstractNum>
-  <w:abstractNum w:abstractNumId="3" w15:restartNumberingAfterBreak="0">
+  <w:abstractNum w:abstractNumId="4" w15:restartNumberingAfterBreak="0">
     <w:nsid w:val="3D6E53E9"/>
     <w:multiLevelType w:val="hybridMultilevel"/>
     <w:tmpl w:val="D78EFCC2"/>
@@ -1605,7 +1793,7 @@
       </w:pPr>
     </w:lvl>
   </w:abstractNum>
-  <w:abstractNum w:abstractNumId="4" w15:restartNumberingAfterBreak="0">
+  <w:abstractNum w:abstractNumId="5" w15:restartNumberingAfterBreak="0">
     <w:nsid w:val="3DBB7168"/>
     <w:multiLevelType w:val="hybridMultilevel"/>
     <w:tmpl w:val="18CEE80E"/>
@@ -1718,7 +1906,7 @@
       </w:rPr>
     </w:lvl>
   </w:abstractNum>
-  <w:abstractNum w:abstractNumId="5" w15:restartNumberingAfterBreak="0">
+  <w:abstractNum w:abstractNumId="6" w15:restartNumberingAfterBreak="0">
     <w:nsid w:val="440779FE"/>
     <w:multiLevelType w:val="hybridMultilevel"/>
     <w:tmpl w:val="C7B63102"/>
@@ -1831,7 +2019,7 @@
       </w:rPr>
     </w:lvl>
   </w:abstractNum>
-  <w:abstractNum w:abstractNumId="6" w15:restartNumberingAfterBreak="0">
+  <w:abstractNum w:abstractNumId="7" w15:restartNumberingAfterBreak="0">
     <w:nsid w:val="49883CF7"/>
     <w:multiLevelType w:val="hybridMultilevel"/>
     <w:tmpl w:val="2F808CDA"/>
@@ -1944,7 +2132,7 @@
       </w:rPr>
     </w:lvl>
   </w:abstractNum>
-  <w:abstractNum w:abstractNumId="7" w15:restartNumberingAfterBreak="0">
+  <w:abstractNum w:abstractNumId="8" w15:restartNumberingAfterBreak="0">
     <w:nsid w:val="4A0F5D00"/>
     <w:multiLevelType w:val="hybridMultilevel"/>
     <w:tmpl w:val="018A5776"/>
@@ -2057,7 +2245,7 @@
       </w:rPr>
     </w:lvl>
   </w:abstractNum>
-  <w:abstractNum w:abstractNumId="8" w15:restartNumberingAfterBreak="0">
+  <w:abstractNum w:abstractNumId="9" w15:restartNumberingAfterBreak="0">
     <w:nsid w:val="4B3D1744"/>
     <w:multiLevelType w:val="hybridMultilevel"/>
     <w:tmpl w:val="5FACA96A"/>
@@ -2143,7 +2331,7 @@
       </w:pPr>
     </w:lvl>
   </w:abstractNum>
-  <w:abstractNum w:abstractNumId="9" w15:restartNumberingAfterBreak="0">
+  <w:abstractNum w:abstractNumId="10" w15:restartNumberingAfterBreak="0">
     <w:nsid w:val="4D1E4DF5"/>
     <w:multiLevelType w:val="hybridMultilevel"/>
     <w:tmpl w:val="A496BA9E"/>
@@ -2256,7 +2444,7 @@
       </w:rPr>
     </w:lvl>
   </w:abstractNum>
-  <w:abstractNum w:abstractNumId="10" w15:restartNumberingAfterBreak="0">
+  <w:abstractNum w:abstractNumId="11" w15:restartNumberingAfterBreak="0">
     <w:nsid w:val="4D3A65D6"/>
     <w:multiLevelType w:val="hybridMultilevel"/>
     <w:tmpl w:val="242885FA"/>
@@ -2369,7 +2557,7 @@
       </w:rPr>
     </w:lvl>
   </w:abstractNum>
-  <w:abstractNum w:abstractNumId="11" w15:restartNumberingAfterBreak="0">
+  <w:abstractNum w:abstractNumId="12" w15:restartNumberingAfterBreak="0">
     <w:nsid w:val="500812A4"/>
     <w:multiLevelType w:val="hybridMultilevel"/>
     <w:tmpl w:val="953EFC1A"/>
@@ -2482,7 +2670,7 @@
       </w:rPr>
     </w:lvl>
   </w:abstractNum>
-  <w:abstractNum w:abstractNumId="12" w15:restartNumberingAfterBreak="0">
+  <w:abstractNum w:abstractNumId="13" w15:restartNumberingAfterBreak="0">
     <w:nsid w:val="518654DC"/>
     <w:multiLevelType w:val="hybridMultilevel"/>
     <w:tmpl w:val="6EEA7636"/>
@@ -2568,7 +2756,7 @@
       </w:pPr>
     </w:lvl>
   </w:abstractNum>
-  <w:abstractNum w:abstractNumId="13" w15:restartNumberingAfterBreak="0">
+  <w:abstractNum w:abstractNumId="14" w15:restartNumberingAfterBreak="0">
     <w:nsid w:val="70124390"/>
     <w:multiLevelType w:val="hybridMultilevel"/>
     <w:tmpl w:val="714CE7A8"/>
@@ -2681,7 +2869,7 @@
       </w:rPr>
     </w:lvl>
   </w:abstractNum>
-  <w:abstractNum w:abstractNumId="14" w15:restartNumberingAfterBreak="0">
+  <w:abstractNum w:abstractNumId="15" w15:restartNumberingAfterBreak="0">
     <w:nsid w:val="7C9A6AFB"/>
     <w:multiLevelType w:val="hybridMultilevel"/>
     <w:tmpl w:val="CBF4D3E2"/>
@@ -2795,49 +2983,52 @@
     </w:lvl>
   </w:abstractNum>
   <w:num w:numId="1" w16cid:durableId="1615406813">
-    <w:abstractNumId w:val="1"/>
+    <w:abstractNumId w:val="2"/>
   </w:num>
   <w:num w:numId="2" w16cid:durableId="1607076917">
+    <w:abstractNumId w:val="14"/>
+  </w:num>
+  <w:num w:numId="3" w16cid:durableId="547883308">
+    <w:abstractNumId w:val="15"/>
+  </w:num>
+  <w:num w:numId="4" w16cid:durableId="1159540764">
+    <w:abstractNumId w:val="11"/>
+  </w:num>
+  <w:num w:numId="5" w16cid:durableId="62263969">
+    <w:abstractNumId w:val="12"/>
+  </w:num>
+  <w:num w:numId="6" w16cid:durableId="1698197646">
+    <w:abstractNumId w:val="6"/>
+  </w:num>
+  <w:num w:numId="7" w16cid:durableId="1455716257">
+    <w:abstractNumId w:val="3"/>
+  </w:num>
+  <w:num w:numId="8" w16cid:durableId="1248733404">
+    <w:abstractNumId w:val="7"/>
+  </w:num>
+  <w:num w:numId="9" w16cid:durableId="1848715268">
+    <w:abstractNumId w:val="10"/>
+  </w:num>
+  <w:num w:numId="10" w16cid:durableId="1419139022">
+    <w:abstractNumId w:val="9"/>
+  </w:num>
+  <w:num w:numId="11" w16cid:durableId="152109467">
     <w:abstractNumId w:val="13"/>
   </w:num>
-  <w:num w:numId="3" w16cid:durableId="547883308">
-    <w:abstractNumId w:val="14"/>
-  </w:num>
-  <w:num w:numId="4" w16cid:durableId="1159540764">
-    <w:abstractNumId w:val="10"/>
-  </w:num>
-  <w:num w:numId="5" w16cid:durableId="62263969">
-    <w:abstractNumId w:val="11"/>
-  </w:num>
-  <w:num w:numId="6" w16cid:durableId="1698197646">
-    <w:abstractNumId w:val="5"/>
-  </w:num>
-  <w:num w:numId="7" w16cid:durableId="1455716257">
-    <w:abstractNumId w:val="2"/>
-  </w:num>
-  <w:num w:numId="8" w16cid:durableId="1248733404">
-    <w:abstractNumId w:val="6"/>
-  </w:num>
-  <w:num w:numId="9" w16cid:durableId="1848715268">
-    <w:abstractNumId w:val="9"/>
-  </w:num>
-  <w:num w:numId="10" w16cid:durableId="1419139022">
-    <w:abstractNumId w:val="8"/>
-  </w:num>
-  <w:num w:numId="11" w16cid:durableId="152109467">
-    <w:abstractNumId w:val="12"/>
-  </w:num>
   <w:num w:numId="12" w16cid:durableId="361053682">
-    <w:abstractNumId w:val="3"/>
+    <w:abstractNumId w:val="4"/>
   </w:num>
   <w:num w:numId="13" w16cid:durableId="2085300736">
     <w:abstractNumId w:val="0"/>
   </w:num>
   <w:num w:numId="14" w16cid:durableId="1752005099">
-    <w:abstractNumId w:val="4"/>
+    <w:abstractNumId w:val="5"/>
   </w:num>
   <w:num w:numId="15" w16cid:durableId="1516190411">
-    <w:abstractNumId w:val="7"/>
+    <w:abstractNumId w:val="8"/>
+  </w:num>
+  <w:num w:numId="16" w16cid:durableId="524443706">
+    <w:abstractNumId w:val="1"/>
   </w:num>
 </w:numbering>
 </file>

</xml_diff>

<commit_message>
55 - Updated Documentation
</commit_message>
<xml_diff>
--- a/documentation/Sprint4.docx
+++ b/documentation/Sprint4.docx
@@ -98,7 +98,10 @@
         <w:t>Sprint duration</w:t>
       </w:r>
       <w:r>
-        <w:t>: 20.11.2025 – 27.11.2025</w:t>
+        <w:t xml:space="preserve">: </w:t>
+      </w:r>
+      <w:r>
+        <w:t>27.11.2025 – 04.11.2025</w:t>
       </w:r>
     </w:p>
     <w:p>

</xml_diff>